<commit_message>
M16: regenerate saltmarsh-environmental under the wave's knobs (baseline)
Wholesale regen through the live airlock (claude-opus-4-8[1m], xhigh).
Baseline realism: business_calendar (0 weekend meetings), book_is_sample,
style_specs (10 specs), voice_diversify. Scans + OCR layer + multi-affiliation
boundary person all retained. Validates clean (29 rules, 0 errors); 31
authored docs 0 off brief; self-scores 100%; byte-pin re-derives; org-tier
green.
</commit_message>
<xml_diff>
--- a/companies/saltmarsh-environmental/Engagements/Carter and Sons/2019.02.04 - Kickoff Memo - Habitat Restoration Monitoring.docx
+++ b/companies/saltmarsh-environmental/Engagements/Carter and Sons/2019.02.04 - Kickoff Memo - Habitat Restoration Monitoring.docx
@@ -3,31 +3,32 @@
 <w:document xmlns:wpc="http://schemas.microsoft.com/office/word/2010/wordprocessingCanvas" xmlns:mo="http://schemas.microsoft.com/office/mac/office/2008/main" xmlns:mc="http://schemas.openxmlformats.org/markup-compatibility/2006" xmlns:mv="urn:schemas-microsoft-com:mac:vml" xmlns:o="urn:schemas-microsoft-com:office:office" xmlns:r="http://schemas.openxmlformats.org/officeDocument/2006/relationships" xmlns:m="http://schemas.openxmlformats.org/officeDocument/2006/math" xmlns:v="urn:schemas-microsoft-com:vml" xmlns:wp14="http://schemas.microsoft.com/office/word/2010/wordprocessingDrawing" xmlns:wp="http://schemas.openxmlformats.org/drawingml/2006/wordprocessingDrawing" xmlns:w10="urn:schemas-microsoft-com:office:word" xmlns:w="http://schemas.openxmlformats.org/wordprocessingml/2006/main" xmlns:w14="http://schemas.microsoft.com/office/word/2010/wordml" xmlns:wpg="http://schemas.microsoft.com/office/word/2010/wordprocessingGroup" xmlns:wpi="http://schemas.microsoft.com/office/word/2010/wordprocessingInk" xmlns:wne="http://schemas.microsoft.com/office/word/2006/wordml" xmlns:wps="http://schemas.microsoft.com/office/word/2010/wordprocessingShape" mc:Ignorable="w14 wp14">
   <w:body>
     <w:p>
-      <w:pPr>
-        <w:pStyle w:val="Heading1"/>
-      </w:pPr>
       <w:r>
-        <w:t>Memorandum</w:t>
+        <w:t>To: James Henderson, Environmental Scientist</w:t>
+        <w:br/>
+        <w:t>From: William Schwartz, Field Technician</w:t>
+        <w:br/>
+        <w:t>Re: Carter and Sons restoration monitoring, start-up</w:t>
       </w:r>
     </w:p>
     <w:p>
       <w:r>
-        <w:t>To: Project team, Habitat Restoration Monitoring</w:t>
+        <w:t>This memo starts the monitoring season for Carter and Sons. The engagement is one season of the restoration monitoring the site's permit requires. Our job is plain. Measure the site on the plan's method, check it against the permit's success criteria, and produce the monitoring report the agency will read.</w:t>
       </w:r>
     </w:p>
     <w:p>
       <w:r>
-        <w:t>From: William Schwartz, Field Technician</w:t>
+        <w:t>Three things come out of the season. The monitoring report, the data workbook behind it, and the field record for every visit. The report goes to the agency. The other two are what let anyone check it.</w:t>
       </w:r>
     </w:p>
     <w:p>
       <w:r>
-        <w:t>Subject: Kickoff, monitoring program for Carter and Sons</w:t>
+        <w:t>This is one season of a multi-season monitoring requirement. Each season has to read against the others. So we hold the method fixed and keep the stations where the plan puts them, from the first visit to the last.</w:t>
       </w:r>
     </w:p>
     <w:p>
       <w:r>
-        <w:t>Work commenced February 1, 2019. This memo is the plan we agreed to in the office so that nobody has to reconstruct it from memory in April. The objective is one monitoring event and one report the agency can check line by line: vegetation, hydrology, sediment, invasives, photographs. Everything below serves that. Anything not below is out of scope and goes to Angela before we touch it.</w:t>
+        <w:t>The report is written for an agency reviewer, not for us. Someone may open it years from now with no one left to ask what a note meant. So we write the record so it reads without us, and we keep it plain.</w:t>
       </w:r>
     </w:p>
     <w:p>
@@ -35,7 +36,7 @@
         <w:pStyle w:val="Heading2"/>
       </w:pPr>
       <w:r>
-        <w:t>Workstreams</w:t>
+        <w:t>The season's work, by piece</w:t>
       </w:r>
     </w:p>
     <w:p>
@@ -43,7 +44,7 @@
         <w:pStyle w:val="ListBullet"/>
       </w:pPr>
       <w:r>
-        <w:t>Plot and station layout. I set the vegetation plots and the photo stations off the as-built and the planting plan, mark them, and record coordinates. Stations get a bearing written on the tag. Same ground, same bearing, every visit, or the photographs are worth nothing next year.</w:t>
+        <w:t>Vegetation. Record species and cover along the fixed transects and in the sample plots. Same transects, same plots, same method the plan sets.</w:t>
       </w:r>
     </w:p>
     <w:p>
@@ -51,7 +52,7 @@
         <w:pStyle w:val="ListBullet"/>
       </w:pPr>
       <w:r>
-        <w:t>Hydrology. Wells and the staff gauge on a fixed interval. Meter calibrated the morning of each reading and the calibration written in the book before we leave the office, not after. Readings referenced to the predicted tide for that day.</w:t>
+        <w:t>Hydrology. Read the established gauges on each visit. Log the reading, the station, and the date.</w:t>
       </w:r>
     </w:p>
     <w:p>
@@ -59,7 +60,7 @@
         <w:pStyle w:val="ListBullet"/>
       </w:pPr>
       <w:r>
-        <w:t>Vegetation. Composition, cover by stratum, survival counts of installed stock, plot by plot. Two observers on each plot, reconciled in the plot. James Henderson runs the call on species we disagree about.</w:t>
+        <w:t>Photo stations. Shoot each station from the same point and the same heading, so the panels line up against prior years.</w:t>
       </w:r>
     </w:p>
     <w:p>
@@ -67,7 +68,7 @@
         <w:pStyle w:val="ListBullet"/>
       </w:pPr>
       <w:r>
-        <w:t>Sediment. Outfall and reference location. James Henderson owns the chain of custody end to end, including labelling at the point of collection and holding times on the form. Nothing gets labelled at the truck. If a hold is blown we say so in the report and we do not use the number.</w:t>
+        <w:t>Invasive species. Note presence and extent across the area. Flag anything that has spread since the last record.</w:t>
       </w:r>
     </w:p>
     <w:p>
@@ -75,7 +76,7 @@
         <w:pStyle w:val="ListBullet"/>
       </w:pPr>
       <w:r>
-        <w:t>Invasives. Patch mapping in the restoration area and the fifty-foot buffer. Extent estimated in the field, sketched on the aerial, tabulated after.</w:t>
+        <w:t>Field record. Tie every observation to its plot, its station, and its date. Notes go into the workbook on the day, not at month end.</w:t>
       </w:r>
     </w:p>
     <w:p>
@@ -83,7 +84,35 @@
         <w:pStyle w:val="ListBullet"/>
       </w:pPr>
       <w:r>
-        <w:t>Report. James Henderson drafts. Angela Flynn reviews before anything goes out. Method first, then what we measured, then each performance standard on its own terms.</w:t>
+        <w:t>Access and safety. Confirm the crossing to the far plots and the on-site contact before each visit.</w:t>
+      </w:r>
+    </w:p>
+    <w:p>
+      <w:pPr>
+        <w:pStyle w:val="ListBullet"/>
+      </w:pPr>
+      <w:r>
+        <w:t>Report. James Henderson drafts the monitoring report from the checked data. It states what was measured, where, and when, and compares against the success criteria.</w:t>
+      </w:r>
+    </w:p>
+    <w:p>
+      <w:r>
+        <w:t>Our contact at Carter and Sons is Heather Smith, their Chief Financial Officer. She handles site access and scheduling on their end. If a visit has to move for the tide or the weather, she is the one to tell, and to tell early.</w:t>
+      </w:r>
+    </w:p>
+    <w:p>
+      <w:r>
+        <w:t>The visits are planned to the season and the tide, not to a fixed calendar. That can move a day here or there. It does not change the stations, the method, or what we deliver.</w:t>
+      </w:r>
+    </w:p>
+    <w:p>
+      <w:r>
+        <w:t>One thing on the field record. Enter the notes the day of the visit, while the site is fresh, and bring me anything that looks off on site instead of working around it. Two of the plots sit across the channel and are only safe to reach on the right water. Nobody works a station that is not safe to work, and a plot missed for the tide is caught on the next suitable window.</w:t>
+      </w:r>
+    </w:p>
+    <w:p>
+      <w:r>
+        <w:t>On a visit day the split is simple. I run the stations and the record. James takes the desk side and the write-up. The workbook totals are checked before anything is submitted, so a figure that leaves the office is one someone has stood behind.</w:t>
       </w:r>
     </w:p>
     <w:p>
@@ -91,70 +120,17 @@
         <w:pStyle w:val="Heading2"/>
       </w:pPr>
       <w:r>
-        <w:t>Field days</w:t>
+        <w:t>Before the first visit</w:t>
       </w:r>
     </w:p>
     <w:p>
       <w:r>
-        <w:t>I schedule them off the tide and the forecast, not off the calendar. If the water or the weather is wrong, the day moves. That is in the engagement letter and the client has been told to expect it, so nobody needs to negotiate it with me on the morning. What I will not do is collect a number I would have to caveat in the report.</w:t>
+        <w:t>Field work begins on February 1, 2019. Before then, I want the transect and plot list confirmed against the monitoring plan, the gauges and photo stations located and checked, and the field kit gone over. James and I will walk the visit order this week.</w:t>
       </w:r>
     </w:p>
     <w:p>
       <w:r>
-        <w:t>Boat, meters, and the well tape are mine. They get checked the day before, not the morning of. Anyone who needs equipment on a field day tells me the week before. The tide predictions for the whole monitoring window are already pulled and in the folder, so the candidate days are knowable in advance and there is no reason for anyone to be surprised by one.</w:t>
-      </w:r>
-    </w:p>
-    <w:p>
-      <w:pPr>
-        <w:pStyle w:val="Heading2"/>
-      </w:pPr>
-      <w:r>
-        <w:t>Next steps</w:t>
-      </w:r>
-    </w:p>
-    <w:p>
-      <w:pPr>
-        <w:pStyle w:val="ListBullet"/>
-      </w:pPr>
-      <w:r>
-        <w:t>I lay out plots and photo stations on the first workable tide and circulate the coordinate list to the file.</w:t>
-      </w:r>
-    </w:p>
-    <w:p>
-      <w:pPr>
-        <w:pStyle w:val="ListBullet"/>
-      </w:pPr>
-      <w:r>
-        <w:t>James Henderson confirms the laboratory's turnaround and holding times before the first sampling day and puts the chain-of-custody forms in the truck box.</w:t>
-      </w:r>
-    </w:p>
-    <w:p>
-      <w:pPr>
-        <w:pStyle w:val="ListBullet"/>
-      </w:pPr>
-      <w:r>
-        <w:t>I pull the tide predictions for the monitoring window and post the candidate field days on the board. Candidate, not committed.</w:t>
-      </w:r>
-    </w:p>
-    <w:p>
-      <w:pPr>
-        <w:pStyle w:val="ListBullet"/>
-      </w:pPr>
-      <w:r>
-        <w:t>Angela Flynn reviews the plot layout against the permit conditions before we read the first plot.</w:t>
-      </w:r>
-    </w:p>
-    <w:p>
-      <w:pPr>
-        <w:pStyle w:val="ListBullet"/>
-      </w:pPr>
-      <w:r>
-        <w:t>Invoicing and any question about the terms go to Heather Smith at Carter and Sons. Scope questions come to Angela Flynn first. Neither of those is a field decision and neither is mine.</w:t>
-      </w:r>
-    </w:p>
-    <w:p>
-      <w:r>
-        <w:t>Field books stay in the truck box and get copied to the project folder the day they are used. If it is not written down it did not happen, and if it happened three weeks ago and is not written down, it did not happen either.</w:t>
+        <w:t>The single next step is the site walk. James and I confirm the station order and the access points this week, so the first day on site is spent measuring and not deciding. — William Schwartz</w:t>
       </w:r>
     </w:p>
     <w:sectPr>

</xml_diff>